<commit_message>
feat(market-tracker): add deferred tracker skeleton
</commit_message>
<xml_diff>
--- a/docs/conceptual/Project_Concept.docx
+++ b/docs/conceptual/Project_Concept.docx
@@ -3289,6 +3289,20 @@
         <w:pStyle w:val="Heading1"/>
       </w:pPr>
       <w:r>
+        <w:t>Market Tracker</w:t>
+      </w:r>
+    </w:p>
+    <w:p>
+      <w:pPr/>
+      <w:r>
+        <w:t>Market Tracker is an authenticated Inspect surface for a future interactive price/time chart, symbol watchlist, timeframe controls, and activity overlays. Its skeleton is intentionally provider-free: it preserves the shared UTC range and default 1Day timeframe, but shows an explicit integration-deferred state with no fabricated symbols, prices, positions, orders, fills, or provider claims. Future overlays distinguish confirmed fill, order, proposal, decision, no_trade, and shadow events; only confirmed fills qualify as actual trades. The planned flow remains Browser -&gt; authenticated Next.js server adapter -&gt; FastAPI -&gt; server-only Alpaca and persisted PRISM repositories. Historical bars and snapshots are the first future milestone, followed by server-owned streams and reconciliation; the browser never receives provider credentials.</w:t>
+      </w:r>
+    </w:p>
+    <w:p>
+      <w:pPr>
+        <w:pStyle w:val="Heading1"/>
+      </w:pPr>
+      <w:r>
         <w:t>Delivery scope</w:t>
       </w:r>
     </w:p>

</xml_diff>

<commit_message>
feat(research): consolidate quantitative analysis slice
</commit_message>
<xml_diff>
--- a/docs/conceptual/Project_Concept.docx
+++ b/docs/conceptual/Project_Concept.docx
@@ -466,7 +466,7 @@
     </w:p>
     <w:p>
       <w:r>
-        <w:t>The current product is a contract-aligned skeleton. It implements versioned governance data, typed contracts, authenticated news and market-reaction research slices, backend-owned illustrative presentation APIs, a story-first frontend, and deployment/migration foundations. It does not yet implement full specialist orchestration, durable portfolio/authorization/ShadowFund engines, or broker order submission.</w:t>
+        <w:t>The current product is a contract-aligned skeleton. It implements versioned governance data, typed contracts, authenticated news, deterministic quantitative, and market-reaction research slices, backend-owned illustrative presentation APIs, a story-first frontend, and deployment/migration foundations. It does not yet implement full specialist orchestration, durable portfolio/authorization/ShadowFund engines, or broker order submission.</w:t>
       </w:r>
     </w:p>
     <w:p>
@@ -3258,7 +3258,7 @@
     </w:p>
     <w:p>
       <w:r>
-        <w:t>Provider errors are classified and redacted. The implemented news and market-reaction endpoints run non-authoritative research with structured validation, bounded provider reads, and non-blocking classified retries.</w:t>
+        <w:t>Provider errors are classified and redacted. The implemented news, deterministic quantitative, and market-reaction endpoints run non-authoritative research with structured validation, bounded provider reads, and non-blocking classified retries. Quantitative output is a typed technical report and never an authorization signal.</w:t>
       </w:r>
     </w:p>
     <w:p>
@@ -3286,16 +3286,106 @@
     </w:p>
     <w:p>
       <w:pPr>
-        <w:pStyle w:val="Heading1"/>
+        <w:pStyle w:val="Heading2"/>
       </w:pPr>
       <w:r>
         <w:t>Market Tracker</w:t>
       </w:r>
     </w:p>
     <w:p>
-      <w:pPr/>
       <w:r>
-        <w:t>Market Tracker is an authenticated Inspect surface for a future interactive price/time chart, symbol watchlist, timeframe controls, and activity overlays. Its skeleton is intentionally provider-free: it preserves the shared UTC range and default 1Day timeframe, but shows an explicit integration-deferred state with no fabricated symbols, prices, positions, orders, fills, or provider claims. Future overlays distinguish confirmed fill, order, proposal, decision, no_trade, and shadow events; only confirmed fills qualify as actual trades. The planned flow remains Browser -&gt; authenticated Next.js server adapter -&gt; FastAPI -&gt; server-only Alpaca and persisted PRISM repositories. Historical bars and snapshots are the first future milestone, followed by server-owned streams and reconciliation; the browser never receives provider credentials.</w:t>
+        <w:t xml:space="preserve">Market Tracker is an authenticated Inspect surface for a future interactive price/time chart, symbol watchlist, timeframe controls, and activity overlays. Its skeleton is intentionally provider-free: it preserves the shared UTC range and default </w:t>
+      </w:r>
+      <w:r>
+        <w:rPr>
+          <w:rFonts w:ascii="Cascadia Mono" w:hAnsi="Cascadia Mono" w:eastAsia="Cascadia Mono"/>
+          <w:b w:val="0"/>
+          <w:color w:val="0B0F14"/>
+          <w:sz w:val="18"/>
+          <w:shd w:fill="E7EEEE"/>
+        </w:rPr>
+        <w:t>1Day</w:t>
+      </w:r>
+      <w:r>
+        <w:t xml:space="preserve"> timeframe, but shows an explicit integration-deferred state with no fabricated symbols, prices, positions, orders, fills, or provider claims. Future overlays distinguish confirmed </w:t>
+      </w:r>
+      <w:r>
+        <w:rPr>
+          <w:rFonts w:ascii="Cascadia Mono" w:hAnsi="Cascadia Mono" w:eastAsia="Cascadia Mono"/>
+          <w:b w:val="0"/>
+          <w:color w:val="0B0F14"/>
+          <w:sz w:val="18"/>
+          <w:shd w:fill="E7EEEE"/>
+        </w:rPr>
+        <w:t>fill</w:t>
+      </w:r>
+      <w:r>
+        <w:t xml:space="preserve">, </w:t>
+      </w:r>
+      <w:r>
+        <w:rPr>
+          <w:rFonts w:ascii="Cascadia Mono" w:hAnsi="Cascadia Mono" w:eastAsia="Cascadia Mono"/>
+          <w:b w:val="0"/>
+          <w:color w:val="0B0F14"/>
+          <w:sz w:val="18"/>
+          <w:shd w:fill="E7EEEE"/>
+        </w:rPr>
+        <w:t>order</w:t>
+      </w:r>
+      <w:r>
+        <w:t xml:space="preserve">, </w:t>
+      </w:r>
+      <w:r>
+        <w:rPr>
+          <w:rFonts w:ascii="Cascadia Mono" w:hAnsi="Cascadia Mono" w:eastAsia="Cascadia Mono"/>
+          <w:b w:val="0"/>
+          <w:color w:val="0B0F14"/>
+          <w:sz w:val="18"/>
+          <w:shd w:fill="E7EEEE"/>
+        </w:rPr>
+        <w:t>proposal</w:t>
+      </w:r>
+      <w:r>
+        <w:t xml:space="preserve">, </w:t>
+      </w:r>
+      <w:r>
+        <w:rPr>
+          <w:rFonts w:ascii="Cascadia Mono" w:hAnsi="Cascadia Mono" w:eastAsia="Cascadia Mono"/>
+          <w:b w:val="0"/>
+          <w:color w:val="0B0F14"/>
+          <w:sz w:val="18"/>
+          <w:shd w:fill="E7EEEE"/>
+        </w:rPr>
+        <w:t>decision</w:t>
+      </w:r>
+      <w:r>
+        <w:t xml:space="preserve">, </w:t>
+      </w:r>
+      <w:r>
+        <w:rPr>
+          <w:rFonts w:ascii="Cascadia Mono" w:hAnsi="Cascadia Mono" w:eastAsia="Cascadia Mono"/>
+          <w:b w:val="0"/>
+          <w:color w:val="0B0F14"/>
+          <w:sz w:val="18"/>
+          <w:shd w:fill="E7EEEE"/>
+        </w:rPr>
+        <w:t>no_trade</w:t>
+      </w:r>
+      <w:r>
+        <w:t xml:space="preserve">, and </w:t>
+      </w:r>
+      <w:r>
+        <w:rPr>
+          <w:rFonts w:ascii="Cascadia Mono" w:hAnsi="Cascadia Mono" w:eastAsia="Cascadia Mono"/>
+          <w:b w:val="0"/>
+          <w:color w:val="0B0F14"/>
+          <w:sz w:val="18"/>
+          <w:shd w:fill="E7EEEE"/>
+        </w:rPr>
+        <w:t>shadow</w:t>
+      </w:r>
+      <w:r>
+        <w:t xml:space="preserve"> events; only confirmed fills qualify as actual trades. The planned flow remains Browser -&gt; authenticated Next.js server adapter -&gt; FastAPI -&gt; server-only Alpaca and persisted PRISM repositories. Historical bars and snapshots are the first future milestone, followed by server-owned streams and reconciliation; the browser never receives provider credentials.</w:t>
       </w:r>
     </w:p>
     <w:p>
@@ -3359,7 +3449,7 @@
         <w:pStyle w:val="ListBullet"/>
       </w:pPr>
       <w:r>
-        <w:t>implemented news and market-reaction research slices with redacted failures;</w:t>
+        <w:t>implemented news, deterministic quantitative, and market-reaction research slices with redacted failures;</w:t>
       </w:r>
     </w:p>
     <w:p>

</xml_diff>

<commit_message>
feat(backtest): persist post-analysis batch and synchronize documentation
</commit_message>
<xml_diff>
--- a/docs/conceptual/Project_Concept.docx
+++ b/docs/conceptual/Project_Concept.docx
@@ -1093,7 +1093,7 @@
         <w:br/>
         <w:t xml:space="preserve">  -&gt; ShadowFund comparison</w:t>
         <w:br/>
-        <w:t xml:space="preserve">  -&gt; Post-Analysis recommendation for manual review</w:t>
+        <w:t xml:space="preserve">  -&gt; Post-Analysis batch and bounded profile-review path</w:t>
       </w:r>
     </w:p>
     <w:p>
@@ -1188,7 +1188,7 @@
         <w:pStyle w:val="ListNumber"/>
       </w:pPr>
       <w:r>
-        <w:t>Post-Analysis may recommend limited AI Profile adjustments, but a human must review them.</w:t>
+        <w:t>Post-Analysis persists one immutable batch; the current implementation records NO_RECOMMENDATION until evidence-qualified recommendations are available.</w:t>
       </w:r>
     </w:p>
     <w:p>
@@ -2175,11 +2175,9 @@
         <w:rPr>
           <w:b/>
         </w:rPr>
-        <w:t>Post-Analysis</w:t>
+        <w:t>Post-Analysis persists a bounded batch after scoring or a completed backtest. The current implementation records NO_RECOMMENDATION until an evidence-qualified recommendation producer is available.</w:t>
       </w:r>
-      <w:r>
-        <w:t xml:space="preserve"> recommends bounded profile changes that still require validation and manual review.</w:t>
-      </w:r>
+      <w:r/>
     </w:p>
     <w:p>
       <w:r>
@@ -5364,7 +5362,7 @@
     </w:p>
     <w:p>
       <w:r>
-        <w:t>Post-Analysis may recommend changes only to target size, opportunity threshold, take-profit, and the fixed stop-loss field. Recommendations must stay within authorized bounds, pass deterministic validation, and receive manual review. Automatic profile switching is not authorized.</w:t>
+        <w:t>Post-Analysis may recommend changes only to target size, opportunity threshold, take-profit, and the fixed stop-loss field. Recommendations must stay within authorized bounds and pass deterministic validation. A supplied, complete draft batch may be activated manually or automatically only when the authenticated operator's persisted preference is automatic; the current implementation records NO_RECOMMENDATION until an evidence-qualified recommendation producer is available.</w:t>
       </w:r>
     </w:p>
     <w:p>
@@ -5479,11 +5477,9 @@
         <w:rPr>
           <w:b/>
         </w:rPr>
-        <w:t>Controlled learning:</w:t>
+        <w:t>Controlled learning: Post-Analysis batch evidence, bounded profile recommendations when available, deterministic validation, and manual or operator-configured automatic activation.</w:t>
       </w:r>
-      <w:r>
-        <w:t xml:space="preserve"> Post-Analysis evidence, bounded profile recommendations, deterministic validation, and manual activation.</w:t>
-      </w:r>
+      <w:r/>
     </w:p>
     <w:p>
       <w:r>

</xml_diff>

<commit_message>
feat(profiles): calibrate opportunity thresholds and publish backtest v1 report
</commit_message>
<xml_diff>
--- a/docs/conceptual/Project_Concept.docx
+++ b/docs/conceptual/Project_Concept.docx
@@ -1188,7 +1188,20 @@
         <w:pStyle w:val="ListNumber"/>
       </w:pPr>
       <w:r>
-        <w:t>Post-Analysis persists one immutable batch; the current implementation records NO_RECOMMENDATION until evidence-qualified recommendations are available.</w:t>
+        <w:t xml:space="preserve">Post-Analysis persists one immutable batch; the current implementation records </w:t>
+      </w:r>
+      <w:r>
+        <w:rPr>
+          <w:rFonts w:ascii="Cascadia Mono" w:hAnsi="Cascadia Mono" w:eastAsia="Cascadia Mono"/>
+          <w:b w:val="0"/>
+          <w:color w:val="0B0F14"/>
+          <w:sz w:val="18"/>
+          <w:shd w:fill="E7EEEE"/>
+        </w:rPr>
+        <w:t>NO_RECOMMENDATION</w:t>
+      </w:r>
+      <w:r>
+        <w:t xml:space="preserve"> until evidence-qualified recommendations are available.</w:t>
       </w:r>
     </w:p>
     <w:p>
@@ -2175,9 +2188,24 @@
         <w:rPr>
           <w:b/>
         </w:rPr>
-        <w:t>Post-Analysis persists a bounded batch after scoring or a completed backtest. The current implementation records NO_RECOMMENDATION until an evidence-qualified recommendation producer is available.</w:t>
+        <w:t>Post-Analysis</w:t>
       </w:r>
-      <w:r/>
+      <w:r>
+        <w:t xml:space="preserve"> persists a bounded batch after scoring or a completed backtest. The current implementation records </w:t>
+      </w:r>
+      <w:r>
+        <w:rPr>
+          <w:rFonts w:ascii="Cascadia Mono" w:hAnsi="Cascadia Mono" w:eastAsia="Cascadia Mono"/>
+          <w:b w:val="0"/>
+          <w:color w:val="0B0F14"/>
+          <w:sz w:val="18"/>
+          <w:shd w:fill="E7EEEE"/>
+        </w:rPr>
+        <w:t>NO_RECOMMENDATION</w:t>
+      </w:r>
+      <w:r>
+        <w:t xml:space="preserve"> until an evidence-qualified recommendation producer is available.</w:t>
+      </w:r>
     </w:p>
     <w:p>
       <w:r>
@@ -3991,7 +4019,7 @@
                 <w:color w:val="0B0F14"/>
                 <w:sz w:val="18"/>
               </w:rPr>
-              <w:t>Absolute score floor 75; Balanced threshold 84</w:t>
+              <w:t>Absolute score floor 75; Balanced threshold 78</w:t>
             </w:r>
           </w:p>
         </w:tc>
@@ -4937,7 +4965,7 @@
                 <w:color w:val="0B0F14"/>
                 <w:sz w:val="18"/>
               </w:rPr>
-              <w:t>90</w:t>
+              <w:t>85</w:t>
             </w:r>
           </w:p>
         </w:tc>
@@ -5109,7 +5137,7 @@
                 <w:color w:val="0B0F14"/>
                 <w:sz w:val="18"/>
               </w:rPr>
-              <w:t>84</w:t>
+              <w:t>78</w:t>
             </w:r>
           </w:p>
         </w:tc>
@@ -5281,7 +5309,7 @@
                 <w:color w:val="0B0F14"/>
                 <w:sz w:val="18"/>
               </w:rPr>
-              <w:t>80</w:t>
+              <w:t>75</w:t>
             </w:r>
           </w:p>
         </w:tc>
@@ -5362,7 +5390,20 @@
     </w:p>
     <w:p>
       <w:r>
-        <w:t>Post-Analysis may recommend changes only to target size, opportunity threshold, take-profit, and the fixed stop-loss field. Recommendations must stay within authorized bounds and pass deterministic validation. A supplied, complete draft batch may be activated manually or automatically only when the authenticated operator's persisted preference is automatic; the current implementation records NO_RECOMMENDATION until an evidence-qualified recommendation producer is available.</w:t>
+        <w:t xml:space="preserve">Post-Analysis may recommend changes only to target size, opportunity threshold, take-profit, and the fixed stop-loss field. Recommendations must stay within authorized bounds and pass deterministic validation. A supplied, complete draft batch may be activated manually or automatically only when the authenticated operator's persisted preference is automatic; the current implementation records </w:t>
+      </w:r>
+      <w:r>
+        <w:rPr>
+          <w:rFonts w:ascii="Cascadia Mono" w:hAnsi="Cascadia Mono" w:eastAsia="Cascadia Mono"/>
+          <w:b w:val="0"/>
+          <w:color w:val="0B0F14"/>
+          <w:sz w:val="18"/>
+          <w:shd w:fill="E7EEEE"/>
+        </w:rPr>
+        <w:t>NO_RECOMMENDATION</w:t>
+      </w:r>
+      <w:r>
+        <w:t xml:space="preserve"> until an evidence-qualified recommendation producer is available.</w:t>
       </w:r>
     </w:p>
     <w:p>
@@ -5477,9 +5518,11 @@
         <w:rPr>
           <w:b/>
         </w:rPr>
-        <w:t>Controlled learning: Post-Analysis batch evidence, bounded profile recommendations when available, deterministic validation, and manual or operator-configured automatic activation.</w:t>
+        <w:t>Controlled learning:</w:t>
       </w:r>
-      <w:r/>
+      <w:r>
+        <w:t xml:space="preserve"> Post-Analysis batch evidence, bounded profile recommendations when available, deterministic validation, and manual or operator-configured automatic activation.</w:t>
+      </w:r>
     </w:p>
     <w:p>
       <w:r>

</xml_diff>